<commit_message>
Determinación de los datos a registrar
</commit_message>
<xml_diff>
--- a/BitacoraProyecto.docx
+++ b/BitacoraProyecto.docx
@@ -26,6 +26,46 @@
           <w:szCs w:val="28"/>
         </w:rPr>
         <w:t>En esta semana nuestro equipo analizó las necesidades del proyecto y estableció las funciones principales que deberá realizar el sistema. Se determinó que la huella digital será utilizada como medio de identificación para que al colocar una huella previamente registrada, el sistema pueda localizar los datos correspondientes a esa persona.</w:t>
+      </w:r>
+    </w:p>
+    <w:p>
+      <w:pPr>
+        <w:jc w:val="both"/>
+        <w:rPr>
+          <w:rFonts w:hint="default" w:ascii="Arial" w:hAnsi="Arial" w:eastAsia="Helvetica" w:cs="Arial"/>
+          <w:i w:val="0"/>
+          <w:iCs w:val="0"/>
+          <w:caps w:val="0"/>
+          <w:spacing w:val="0"/>
+          <w:sz w:val="28"/>
+          <w:szCs w:val="28"/>
+        </w:rPr>
+      </w:pPr>
+    </w:p>
+    <w:p>
+      <w:pPr>
+        <w:jc w:val="both"/>
+        <w:rPr>
+          <w:rFonts w:hint="default" w:ascii="Arial" w:hAnsi="Arial" w:eastAsia="Helvetica" w:cs="Arial"/>
+          <w:i w:val="0"/>
+          <w:iCs w:val="0"/>
+          <w:caps w:val="0"/>
+          <w:spacing w:val="0"/>
+          <w:sz w:val="28"/>
+          <w:szCs w:val="28"/>
+        </w:rPr>
+      </w:pPr>
+      <w:r>
+        <w:rPr>
+          <w:rFonts w:hint="default" w:ascii="Arial" w:hAnsi="Arial" w:eastAsia="Helvetica" w:cs="Arial"/>
+          <w:i w:val="0"/>
+          <w:iCs w:val="0"/>
+          <w:caps w:val="0"/>
+          <w:spacing w:val="0"/>
+          <w:sz w:val="28"/>
+          <w:szCs w:val="28"/>
+        </w:rPr>
+        <w:t>También se analizaron los usuarios que tendrán acceso al sistema y la información que será necesaria para realizar los registros. Finalmente, se plantearon los requisitos que deberá cumplir el sistema para que pueda funcionar correctamente.</w:t>
       </w:r>
     </w:p>
     <w:p>

</xml_diff>

<commit_message>
Análisis del funcionamiento del sistema
</commit_message>
<xml_diff>
--- a/BitacoraProyecto.docx
+++ b/BitacoraProyecto.docx
@@ -84,6 +84,46 @@
     </w:p>
     <w:p>
       <w:pPr>
+        <w:jc w:val="center"/>
+        <w:rPr>
+          <w:rFonts w:hint="default" w:ascii="Arial" w:hAnsi="Arial" w:eastAsia="Helvetica" w:cs="Arial"/>
+          <w:i w:val="0"/>
+          <w:iCs w:val="0"/>
+          <w:caps w:val="0"/>
+          <w:spacing w:val="0"/>
+          <w:sz w:val="28"/>
+          <w:szCs w:val="28"/>
+        </w:rPr>
+      </w:pPr>
+      <w:r>
+        <w:rPr>
+          <w:rFonts w:hint="default" w:ascii="Arial" w:hAnsi="Arial" w:eastAsia="Helvetica" w:cs="Arial"/>
+          <w:i w:val="0"/>
+          <w:iCs w:val="0"/>
+          <w:caps w:val="0"/>
+          <w:spacing w:val="0"/>
+          <w:sz w:val="28"/>
+          <w:szCs w:val="28"/>
+        </w:rPr>
+        <w:t>----ACTIVIDADES REALIZADAS----</w:t>
+      </w:r>
+    </w:p>
+    <w:p>
+      <w:pPr>
+        <w:jc w:val="center"/>
+        <w:rPr>
+          <w:rFonts w:hint="default" w:ascii="Arial" w:hAnsi="Arial" w:eastAsia="Helvetica" w:cs="Arial"/>
+          <w:i w:val="0"/>
+          <w:iCs w:val="0"/>
+          <w:caps w:val="0"/>
+          <w:spacing w:val="0"/>
+          <w:sz w:val="28"/>
+          <w:szCs w:val="28"/>
+        </w:rPr>
+      </w:pPr>
+    </w:p>
+    <w:p>
+      <w:pPr>
         <w:jc w:val="both"/>
         <w:rPr>
           <w:rFonts w:hint="default" w:ascii="Arial" w:hAnsi="Arial" w:eastAsia="Helvetica" w:cs="Arial"/>
@@ -95,6 +135,70 @@
           <w:szCs w:val="28"/>
         </w:rPr>
       </w:pPr>
+      <w:r>
+        <w:rPr>
+          <w:rFonts w:hint="default" w:ascii="Arial" w:hAnsi="Arial" w:eastAsia="Helvetica" w:cs="Arial"/>
+          <w:i w:val="0"/>
+          <w:iCs w:val="0"/>
+          <w:caps w:val="0"/>
+          <w:spacing w:val="0"/>
+          <w:sz w:val="28"/>
+          <w:szCs w:val="28"/>
+        </w:rPr>
+        <w:t>-Se definio el objetivo principal del proyecto</w:t>
+      </w:r>
+    </w:p>
+    <w:p>
+      <w:pPr>
+        <w:jc w:val="both"/>
+        <w:rPr>
+          <w:rFonts w:hint="default" w:ascii="Arial" w:hAnsi="Arial" w:eastAsia="Helvetica" w:cs="Arial"/>
+          <w:i w:val="0"/>
+          <w:iCs w:val="0"/>
+          <w:caps w:val="0"/>
+          <w:spacing w:val="0"/>
+          <w:sz w:val="28"/>
+          <w:szCs w:val="28"/>
+        </w:rPr>
+      </w:pPr>
+      <w:r>
+        <w:rPr>
+          <w:rFonts w:hint="default" w:ascii="Arial" w:hAnsi="Arial" w:eastAsia="Helvetica" w:cs="Arial"/>
+          <w:i w:val="0"/>
+          <w:iCs w:val="0"/>
+          <w:caps w:val="0"/>
+          <w:spacing w:val="0"/>
+          <w:sz w:val="28"/>
+          <w:szCs w:val="28"/>
+        </w:rPr>
+        <w:t xml:space="preserve">-Se determinaron los datos que seran registrados (Nombre, identificacion, etc) </w:t>
+      </w:r>
+    </w:p>
+    <w:p>
+      <w:pPr>
+        <w:jc w:val="both"/>
+        <w:rPr>
+          <w:rFonts w:hint="default" w:ascii="Arial" w:hAnsi="Arial" w:eastAsia="Helvetica" w:cs="Arial"/>
+          <w:i w:val="0"/>
+          <w:iCs w:val="0"/>
+          <w:caps w:val="0"/>
+          <w:spacing w:val="0"/>
+          <w:sz w:val="28"/>
+          <w:szCs w:val="28"/>
+        </w:rPr>
+      </w:pPr>
+      <w:r>
+        <w:rPr>
+          <w:rFonts w:hint="default" w:ascii="Arial" w:hAnsi="Arial" w:eastAsia="Helvetica" w:cs="Arial"/>
+          <w:i w:val="0"/>
+          <w:iCs w:val="0"/>
+          <w:caps w:val="0"/>
+          <w:spacing w:val="0"/>
+          <w:sz w:val="28"/>
+          <w:szCs w:val="28"/>
+        </w:rPr>
+        <w:t>-Se analizo como se utilizara la huella digital para identificar a una persona registrada</w:t>
+      </w:r>
       <w:bookmarkStart w:id="0" w:name="_GoBack"/>
       <w:bookmarkEnd w:id="0"/>
     </w:p>

</xml_diff>

<commit_message>
Planeacion de estructura del sistema
</commit_message>
<xml_diff>
--- a/BitacoraProyecto.docx
+++ b/BitacoraProyecto.docx
@@ -199,8 +199,521 @@
         </w:rPr>
         <w:t>-Se analizo como se utilizara la huella digital para identificar a una persona registrada</w:t>
       </w:r>
+    </w:p>
+    <w:p>
+      <w:pPr>
+        <w:jc w:val="both"/>
+        <w:rPr>
+          <w:rFonts w:hint="default" w:ascii="Arial" w:hAnsi="Arial" w:eastAsia="Helvetica" w:cs="Arial"/>
+          <w:i w:val="0"/>
+          <w:iCs w:val="0"/>
+          <w:caps w:val="0"/>
+          <w:spacing w:val="0"/>
+          <w:sz w:val="28"/>
+          <w:szCs w:val="28"/>
+        </w:rPr>
+      </w:pPr>
+    </w:p>
+    <w:p>
+      <w:pPr>
+        <w:jc w:val="both"/>
+        <w:rPr>
+          <w:rFonts w:hint="default" w:ascii="Arial" w:hAnsi="Arial" w:eastAsia="Helvetica" w:cs="Arial"/>
+          <w:i w:val="0"/>
+          <w:iCs w:val="0"/>
+          <w:caps w:val="0"/>
+          <w:spacing w:val="0"/>
+          <w:sz w:val="28"/>
+          <w:szCs w:val="28"/>
+          <w:lang w:val="es-MX"/>
+        </w:rPr>
+      </w:pPr>
+      <w:r>
+        <w:rPr>
+          <w:rFonts w:hint="default" w:ascii="Arial" w:hAnsi="Arial" w:eastAsia="Helvetica" w:cs="Arial"/>
+          <w:i w:val="0"/>
+          <w:iCs w:val="0"/>
+          <w:caps w:val="0"/>
+          <w:spacing w:val="0"/>
+          <w:sz w:val="28"/>
+          <w:szCs w:val="28"/>
+          <w:lang w:val="es-MX"/>
+        </w:rPr>
+        <w:t>En la segunda semana se tiene pensado diseñar la estructura general del proyecto haciendo un diagrama de flujo</w:t>
+      </w:r>
+    </w:p>
+    <w:p>
+      <w:pPr>
+        <w:jc w:val="both"/>
+        <w:rPr>
+          <w:rFonts w:hint="default" w:ascii="Arial" w:hAnsi="Arial" w:eastAsia="Helvetica" w:cs="Arial"/>
+          <w:i w:val="0"/>
+          <w:iCs w:val="0"/>
+          <w:caps w:val="0"/>
+          <w:spacing w:val="0"/>
+          <w:sz w:val="28"/>
+          <w:szCs w:val="28"/>
+          <w:lang w:val="es-MX"/>
+        </w:rPr>
+      </w:pPr>
+    </w:p>
+    <w:p>
+      <w:pPr>
+        <w:jc w:val="both"/>
+        <w:rPr>
+          <w:rFonts w:hint="default" w:ascii="Arial" w:hAnsi="Arial" w:eastAsia="Helvetica" w:cs="Arial"/>
+          <w:i w:val="0"/>
+          <w:iCs w:val="0"/>
+          <w:caps w:val="0"/>
+          <w:spacing w:val="0"/>
+          <w:sz w:val="28"/>
+          <w:szCs w:val="28"/>
+          <w:lang w:val="es-MX"/>
+        </w:rPr>
+      </w:pPr>
+      <w:r>
+        <w:rPr>
+          <w:rFonts w:ascii="SimSun" w:hAnsi="SimSun" w:eastAsia="SimSun" w:cs="SimSun"/>
+          <w:b w:val="0"/>
+          <w:bCs w:val="0"/>
+          <w:sz w:val="24"/>
+          <w:szCs w:val="24"/>
+        </w:rPr>
+        <w:drawing>
+          <wp:inline distT="0" distB="0" distL="114300" distR="114300">
+            <wp:extent cx="1958975" cy="2938780"/>
+            <wp:effectExtent l="0" t="0" r="3175" b="13970"/>
+            <wp:docPr id="1" name="Imagen 1" descr="IMG_256"/>
+            <wp:cNvGraphicFramePr>
+              <a:graphicFrameLocks xmlns:a="http://schemas.openxmlformats.org/drawingml/2006/main" noChangeAspect="1"/>
+            </wp:cNvGraphicFramePr>
+            <a:graphic xmlns:a="http://schemas.openxmlformats.org/drawingml/2006/main">
+              <a:graphicData uri="http://schemas.openxmlformats.org/drawingml/2006/picture">
+                <pic:pic xmlns:pic="http://schemas.openxmlformats.org/drawingml/2006/picture">
+                  <pic:nvPicPr>
+                    <pic:cNvPr id="1" name="Imagen 1" descr="IMG_256"/>
+                    <pic:cNvPicPr>
+                      <a:picLocks noChangeAspect="1"/>
+                    </pic:cNvPicPr>
+                  </pic:nvPicPr>
+                  <pic:blipFill>
+                    <a:blip r:embed="rId4"/>
+                    <a:stretch>
+                      <a:fillRect/>
+                    </a:stretch>
+                  </pic:blipFill>
+                  <pic:spPr>
+                    <a:xfrm>
+                      <a:off x="0" y="0"/>
+                      <a:ext cx="1958975" cy="2938780"/>
+                    </a:xfrm>
+                    <a:prstGeom prst="rect">
+                      <a:avLst/>
+                    </a:prstGeom>
+                    <a:noFill/>
+                    <a:ln w="9525">
+                      <a:noFill/>
+                    </a:ln>
+                  </pic:spPr>
+                </pic:pic>
+              </a:graphicData>
+            </a:graphic>
+          </wp:inline>
+        </w:drawing>
+      </w:r>
+    </w:p>
+    <w:p>
+      <w:pPr>
+        <w:jc w:val="both"/>
+        <w:rPr>
+          <w:rFonts w:hint="default" w:ascii="Arial" w:hAnsi="Arial" w:eastAsia="Helvetica" w:cs="Arial"/>
+          <w:b/>
+          <w:bCs/>
+          <w:i/>
+          <w:iCs/>
+          <w:caps w:val="0"/>
+          <w:spacing w:val="0"/>
+          <w:sz w:val="32"/>
+          <w:szCs w:val="32"/>
+          <w:lang w:val="es-MX"/>
+        </w:rPr>
+      </w:pPr>
+      <w:r>
+        <w:rPr>
+          <w:rFonts w:hint="default" w:ascii="Arial" w:hAnsi="Arial" w:eastAsia="Helvetica" w:cs="Arial"/>
+          <w:b/>
+          <w:bCs/>
+          <w:i/>
+          <w:iCs/>
+          <w:caps w:val="0"/>
+          <w:spacing w:val="0"/>
+          <w:sz w:val="32"/>
+          <w:szCs w:val="32"/>
+          <w:lang w:val="es-MX"/>
+        </w:rPr>
+        <w:t>Registro de Persona</w:t>
+      </w:r>
+    </w:p>
+    <w:p>
+      <w:pPr>
+        <w:jc w:val="both"/>
+        <w:rPr>
+          <w:rFonts w:hint="default" w:ascii="Arial" w:hAnsi="Arial" w:eastAsia="Helvetica" w:cs="Arial"/>
+          <w:i w:val="0"/>
+          <w:iCs w:val="0"/>
+          <w:caps w:val="0"/>
+          <w:spacing w:val="0"/>
+          <w:sz w:val="28"/>
+          <w:szCs w:val="28"/>
+          <w:lang w:val="es-MX"/>
+        </w:rPr>
+      </w:pPr>
+      <w:r>
+        <w:rPr>
+          <w:rFonts w:hint="default" w:ascii="Arial" w:hAnsi="Arial" w:eastAsia="Helvetica" w:cs="Arial"/>
+          <w:b/>
+          <w:bCs/>
+          <w:i w:val="0"/>
+          <w:iCs w:val="0"/>
+          <w:caps w:val="0"/>
+          <w:color w:val="000000" w:themeColor="text1"/>
+          <w:spacing w:val="0"/>
+          <w:sz w:val="28"/>
+          <w:szCs w:val="28"/>
+          <w:highlight w:val="none"/>
+          <w:lang w:val="es-MX"/>
+          <w14:textFill>
+            <w14:solidFill>
+              <w14:schemeClr w14:val="tx1"/>
+            </w14:solidFill>
+          </w14:textFill>
+        </w:rPr>
+        <w:t>Se configuró el inicio y la captura de datos</w:t>
+      </w:r>
+      <w:r>
+        <w:rPr>
+          <w:rFonts w:hint="default" w:ascii="Arial" w:hAnsi="Arial" w:eastAsia="Helvetica" w:cs="Arial"/>
+          <w:i w:val="0"/>
+          <w:iCs w:val="0"/>
+          <w:caps w:val="0"/>
+          <w:spacing w:val="0"/>
+          <w:sz w:val="28"/>
+          <w:szCs w:val="28"/>
+          <w:lang w:val="es-MX"/>
+        </w:rPr>
+        <w:t xml:space="preserve">: Se estableció el punto de partida dentro del sistema biométrico para que el operador ingrese la información general del usuario (nombre, edad e ID/Documento de Identidad). </w:t>
+      </w:r>
+    </w:p>
+    <w:p>
+      <w:pPr>
+        <w:jc w:val="both"/>
+        <w:rPr>
+          <w:rFonts w:hint="default" w:ascii="Arial" w:hAnsi="Arial" w:eastAsia="Helvetica" w:cs="Arial"/>
+          <w:i w:val="0"/>
+          <w:iCs w:val="0"/>
+          <w:caps w:val="0"/>
+          <w:spacing w:val="0"/>
+          <w:sz w:val="28"/>
+          <w:szCs w:val="28"/>
+          <w:lang w:val="es-MX"/>
+        </w:rPr>
+      </w:pPr>
+      <w:r>
+        <w:rPr>
+          <w:rFonts w:hint="default" w:ascii="Arial" w:hAnsi="Arial" w:eastAsia="Helvetica" w:cs="Arial"/>
+          <w:i/>
+          <w:iCs/>
+          <w:caps w:val="0"/>
+          <w:spacing w:val="0"/>
+          <w:sz w:val="28"/>
+          <w:szCs w:val="28"/>
+          <w:lang w:val="es-MX"/>
+        </w:rPr>
+        <w:t xml:space="preserve"> </w:t>
+      </w:r>
+      <w:r>
+        <w:rPr>
+          <w:rFonts w:hint="default" w:ascii="Arial" w:hAnsi="Arial" w:eastAsia="Helvetica" w:cs="Arial"/>
+          <w:b/>
+          <w:bCs/>
+          <w:i w:val="0"/>
+          <w:iCs w:val="0"/>
+          <w:caps w:val="0"/>
+          <w:spacing w:val="0"/>
+          <w:sz w:val="28"/>
+          <w:szCs w:val="28"/>
+          <w:lang w:val="es-MX"/>
+        </w:rPr>
+        <w:t>Se implementó la toma y verificación de la huella</w:t>
+      </w:r>
+      <w:r>
+        <w:rPr>
+          <w:rFonts w:hint="default" w:ascii="Arial" w:hAnsi="Arial" w:eastAsia="Helvetica" w:cs="Arial"/>
+          <w:i w:val="0"/>
+          <w:iCs w:val="0"/>
+          <w:caps w:val="0"/>
+          <w:spacing w:val="0"/>
+          <w:sz w:val="28"/>
+          <w:szCs w:val="28"/>
+          <w:lang w:val="es-MX"/>
+        </w:rPr>
+        <w:t xml:space="preserve">: Se programó el escaneo de la huella digital para que el sistema analice su calidad y verifique que cumpla con los estándares técnicos requeridos.   </w:t>
+      </w:r>
+    </w:p>
+    <w:p>
+      <w:pPr>
+        <w:jc w:val="both"/>
+        <w:rPr>
+          <w:rFonts w:hint="default" w:ascii="Arial" w:hAnsi="Arial" w:eastAsia="Helvetica" w:cs="Arial"/>
+          <w:i w:val="0"/>
+          <w:iCs w:val="0"/>
+          <w:caps w:val="0"/>
+          <w:spacing w:val="0"/>
+          <w:sz w:val="28"/>
+          <w:szCs w:val="28"/>
+          <w:lang w:val="es-MX"/>
+        </w:rPr>
+      </w:pPr>
+    </w:p>
+    <w:p>
+      <w:pPr>
+        <w:jc w:val="both"/>
+        <w:rPr>
+          <w:rFonts w:hint="default" w:ascii="Arial" w:hAnsi="Arial" w:eastAsia="Helvetica" w:cs="Arial"/>
+          <w:i w:val="0"/>
+          <w:iCs w:val="0"/>
+          <w:caps w:val="0"/>
+          <w:spacing w:val="0"/>
+          <w:sz w:val="28"/>
+          <w:szCs w:val="28"/>
+          <w:lang w:val="es-MX"/>
+        </w:rPr>
+      </w:pPr>
+      <w:r>
+        <w:rPr>
+          <w:rFonts w:hint="default" w:ascii="Arial" w:hAnsi="Arial" w:eastAsia="Helvetica" w:cs="Arial"/>
+          <w:b/>
+          <w:bCs/>
+          <w:i w:val="0"/>
+          <w:iCs w:val="0"/>
+          <w:caps w:val="0"/>
+          <w:spacing w:val="0"/>
+          <w:sz w:val="28"/>
+          <w:szCs w:val="28"/>
+          <w:lang w:val="es-MX"/>
+        </w:rPr>
+        <w:t>Se estableció la lógica de validación y almacenamiento</w:t>
+      </w:r>
+      <w:r>
+        <w:rPr>
+          <w:rFonts w:hint="default" w:ascii="Arial" w:hAnsi="Arial" w:eastAsia="Helvetica" w:cs="Arial"/>
+          <w:i w:val="0"/>
+          <w:iCs w:val="0"/>
+          <w:caps w:val="0"/>
+          <w:spacing w:val="0"/>
+          <w:sz w:val="28"/>
+          <w:szCs w:val="28"/>
+          <w:lang w:val="es-MX"/>
+        </w:rPr>
+        <w:t xml:space="preserve">: Se definió un punto de decisión donde, si la huella es inválida por mala postura o lectura errónea, el sistema solicita una nueva captura; de lo contrario, se guardan de forma segura los datos y la plantilla biométrica en la base de datos, mostrando un mensaje de éxito para concluir el proceso.   </w:t>
+      </w:r>
+    </w:p>
+    <w:p>
+      <w:pPr>
+        <w:jc w:val="both"/>
+        <w:rPr>
+          <w:rFonts w:hint="default" w:ascii="Arial" w:hAnsi="Arial" w:eastAsia="Helvetica" w:cs="Arial"/>
+          <w:i w:val="0"/>
+          <w:iCs w:val="0"/>
+          <w:caps w:val="0"/>
+          <w:spacing w:val="0"/>
+          <w:sz w:val="28"/>
+          <w:szCs w:val="28"/>
+          <w:lang w:val="es-MX"/>
+        </w:rPr>
+      </w:pPr>
+    </w:p>
+    <w:p>
+      <w:pPr>
+        <w:jc w:val="both"/>
+        <w:rPr>
+          <w:rFonts w:hint="default" w:ascii="Arial" w:hAnsi="Arial" w:eastAsia="Helvetica" w:cs="Arial"/>
+          <w:i w:val="0"/>
+          <w:iCs w:val="0"/>
+          <w:caps w:val="0"/>
+          <w:spacing w:val="0"/>
+          <w:sz w:val="28"/>
+          <w:szCs w:val="28"/>
+          <w:lang w:val="es-MX"/>
+        </w:rPr>
+      </w:pPr>
       <w:bookmarkStart w:id="0" w:name="_GoBack"/>
       <w:bookmarkEnd w:id="0"/>
+    </w:p>
+    <w:p>
+      <w:pPr>
+        <w:jc w:val="both"/>
+        <w:rPr>
+          <w:rFonts w:hint="default" w:ascii="Arial" w:hAnsi="Arial" w:eastAsia="Helvetica" w:cs="Arial"/>
+          <w:i w:val="0"/>
+          <w:iCs w:val="0"/>
+          <w:caps w:val="0"/>
+          <w:spacing w:val="0"/>
+          <w:sz w:val="28"/>
+          <w:szCs w:val="28"/>
+          <w:lang w:val="es-MX"/>
+        </w:rPr>
+      </w:pPr>
+    </w:p>
+    <w:p>
+      <w:pPr>
+        <w:jc w:val="both"/>
+        <w:rPr>
+          <w:rFonts w:hint="default" w:ascii="Arial" w:hAnsi="Arial" w:eastAsia="Helvetica" w:cs="Arial"/>
+          <w:i w:val="0"/>
+          <w:iCs w:val="0"/>
+          <w:caps w:val="0"/>
+          <w:spacing w:val="0"/>
+          <w:sz w:val="28"/>
+          <w:szCs w:val="28"/>
+          <w:lang w:val="es-MX"/>
+        </w:rPr>
+      </w:pPr>
+    </w:p>
+    <w:p>
+      <w:pPr>
+        <w:jc w:val="both"/>
+        <w:rPr>
+          <w:rFonts w:hint="default" w:ascii="Arial" w:hAnsi="Arial" w:eastAsia="Helvetica" w:cs="Arial"/>
+          <w:i w:val="0"/>
+          <w:iCs w:val="0"/>
+          <w:caps w:val="0"/>
+          <w:spacing w:val="0"/>
+          <w:sz w:val="28"/>
+          <w:szCs w:val="28"/>
+          <w:lang w:val="es-MX"/>
+        </w:rPr>
+      </w:pPr>
+    </w:p>
+    <w:p>
+      <w:pPr>
+        <w:jc w:val="both"/>
+        <w:rPr>
+          <w:rFonts w:hint="default" w:ascii="Arial" w:hAnsi="Arial" w:eastAsia="Helvetica" w:cs="Arial"/>
+          <w:i w:val="0"/>
+          <w:iCs w:val="0"/>
+          <w:caps w:val="0"/>
+          <w:spacing w:val="0"/>
+          <w:sz w:val="28"/>
+          <w:szCs w:val="28"/>
+          <w:lang w:val="es-MX"/>
+        </w:rPr>
+      </w:pPr>
+    </w:p>
+    <w:p>
+      <w:pPr>
+        <w:jc w:val="both"/>
+        <w:rPr>
+          <w:rFonts w:hint="default" w:ascii="Arial" w:hAnsi="Arial" w:eastAsia="Helvetica" w:cs="Arial"/>
+          <w:i w:val="0"/>
+          <w:iCs w:val="0"/>
+          <w:caps w:val="0"/>
+          <w:spacing w:val="0"/>
+          <w:sz w:val="28"/>
+          <w:szCs w:val="28"/>
+          <w:lang w:val="es-MX"/>
+        </w:rPr>
+      </w:pPr>
+    </w:p>
+    <w:p>
+      <w:pPr>
+        <w:jc w:val="both"/>
+        <w:rPr>
+          <w:rFonts w:hint="default" w:ascii="Arial" w:hAnsi="Arial" w:eastAsia="Helvetica" w:cs="Arial"/>
+          <w:i w:val="0"/>
+          <w:iCs w:val="0"/>
+          <w:caps w:val="0"/>
+          <w:spacing w:val="0"/>
+          <w:sz w:val="28"/>
+          <w:szCs w:val="28"/>
+          <w:lang w:val="es-MX"/>
+        </w:rPr>
+      </w:pPr>
+    </w:p>
+    <w:p>
+      <w:pPr>
+        <w:jc w:val="both"/>
+        <w:rPr>
+          <w:rFonts w:hint="default" w:ascii="Arial" w:hAnsi="Arial" w:eastAsia="Helvetica" w:cs="Arial"/>
+          <w:i w:val="0"/>
+          <w:iCs w:val="0"/>
+          <w:caps w:val="0"/>
+          <w:spacing w:val="0"/>
+          <w:sz w:val="28"/>
+          <w:szCs w:val="28"/>
+          <w:lang w:val="es-MX"/>
+        </w:rPr>
+      </w:pPr>
+    </w:p>
+    <w:p>
+      <w:pPr>
+        <w:jc w:val="both"/>
+        <w:rPr>
+          <w:rFonts w:hint="default" w:ascii="Arial" w:hAnsi="Arial" w:eastAsia="Helvetica" w:cs="Arial"/>
+          <w:i w:val="0"/>
+          <w:iCs w:val="0"/>
+          <w:caps w:val="0"/>
+          <w:spacing w:val="0"/>
+          <w:sz w:val="28"/>
+          <w:szCs w:val="28"/>
+          <w:lang w:val="es-MX"/>
+        </w:rPr>
+      </w:pPr>
+    </w:p>
+    <w:p>
+      <w:pPr>
+        <w:jc w:val="both"/>
+        <w:rPr>
+          <w:rFonts w:hint="default" w:ascii="Arial" w:hAnsi="Arial" w:eastAsia="Helvetica" w:cs="Arial"/>
+          <w:i w:val="0"/>
+          <w:iCs w:val="0"/>
+          <w:caps w:val="0"/>
+          <w:spacing w:val="0"/>
+          <w:sz w:val="28"/>
+          <w:szCs w:val="28"/>
+          <w:lang w:val="es-MX"/>
+        </w:rPr>
+      </w:pPr>
+    </w:p>
+    <w:p>
+      <w:pPr>
+        <w:jc w:val="both"/>
+        <w:rPr>
+          <w:rFonts w:hint="default" w:ascii="Arial" w:hAnsi="Arial" w:eastAsia="Helvetica" w:cs="Arial"/>
+          <w:i w:val="0"/>
+          <w:iCs w:val="0"/>
+          <w:caps w:val="0"/>
+          <w:spacing w:val="0"/>
+          <w:sz w:val="28"/>
+          <w:szCs w:val="28"/>
+          <w:lang w:val="es-MX"/>
+        </w:rPr>
+      </w:pPr>
+    </w:p>
+    <w:p>
+      <w:pPr>
+        <w:jc w:val="both"/>
+        <w:rPr>
+          <w:rFonts w:hint="default" w:ascii="Arial" w:hAnsi="Arial" w:eastAsia="Helvetica" w:cs="Arial"/>
+          <w:i w:val="0"/>
+          <w:iCs w:val="0"/>
+          <w:caps w:val="0"/>
+          <w:spacing w:val="0"/>
+          <w:sz w:val="28"/>
+          <w:szCs w:val="28"/>
+          <w:lang w:val="es-MX"/>
+        </w:rPr>
+      </w:pPr>
     </w:p>
     <w:sectPr>
       <w:pgSz w:w="11906" w:h="16838"/>
@@ -383,13 +896,34 @@
       <w:lang w:val="en-US" w:eastAsia="zh-CN" w:bidi="ar-SA"/>
     </w:rPr>
   </w:style>
-  <w:style w:type="character" w:default="1" w:styleId="2">
+  <w:style w:type="paragraph" w:styleId="2">
+    <w:name w:val="heading 3"/>
+    <w:next w:val="1"/>
+    <w:semiHidden/>
+    <w:unhideWhenUsed/>
+    <w:qFormat/>
+    <w:uiPriority w:val="0"/>
+    <w:pPr>
+      <w:spacing w:before="0" w:beforeAutospacing="1" w:after="0" w:afterAutospacing="1"/>
+      <w:jc w:val="left"/>
+    </w:pPr>
+    <w:rPr>
+      <w:rFonts w:hint="eastAsia" w:ascii="SimSun" w:hAnsi="SimSun" w:eastAsia="SimSun" w:cs="SimSun"/>
+      <w:b/>
+      <w:bCs/>
+      <w:kern w:val="0"/>
+      <w:sz w:val="27"/>
+      <w:szCs w:val="27"/>
+      <w:lang w:val="en-US" w:eastAsia="zh-CN" w:bidi="ar"/>
+    </w:rPr>
+  </w:style>
+  <w:style w:type="character" w:default="1" w:styleId="3">
     <w:name w:val="Default Paragraph Font"/>
     <w:semiHidden/>
     <w:qFormat/>
     <w:uiPriority w:val="0"/>
   </w:style>
-  <w:style w:type="table" w:default="1" w:styleId="3">
+  <w:style w:type="table" w:default="1" w:styleId="4">
     <w:name w:val="Normal Table"/>
     <w:semiHidden/>
     <w:qFormat/>
@@ -402,6 +936,21 @@
         <w:right w:w="108" w:type="dxa"/>
       </w:tblCellMar>
     </w:tblPr>
+  </w:style>
+  <w:style w:type="paragraph" w:styleId="5">
+    <w:name w:val="Normal (Web)"/>
+    <w:uiPriority w:val="0"/>
+    <w:pPr>
+      <w:spacing w:before="0" w:beforeAutospacing="1" w:after="0" w:afterAutospacing="1"/>
+      <w:ind w:left="0" w:right="0"/>
+      <w:jc w:val="left"/>
+    </w:pPr>
+    <w:rPr>
+      <w:kern w:val="0"/>
+      <w:sz w:val="24"/>
+      <w:szCs w:val="24"/>
+      <w:lang w:val="en-US" w:eastAsia="zh-CN" w:bidi="ar"/>
+    </w:rPr>
   </w:style>
 </w:styles>
 </file>

</xml_diff>

<commit_message>
Integracion de Diagrama de Flujo
</commit_message>
<xml_diff>
--- a/BitacoraProyecto.docx
+++ b/BitacoraProyecto.docx
@@ -532,6 +532,273 @@
           <w:lang w:val="es-MX"/>
         </w:rPr>
       </w:pPr>
+    </w:p>
+    <w:p>
+      <w:pPr>
+        <w:jc w:val="both"/>
+        <w:rPr>
+          <w:rFonts w:hint="default" w:ascii="Arial" w:hAnsi="Arial" w:eastAsia="Helvetica" w:cs="Arial"/>
+          <w:i w:val="0"/>
+          <w:iCs w:val="0"/>
+          <w:caps w:val="0"/>
+          <w:spacing w:val="0"/>
+          <w:sz w:val="28"/>
+          <w:szCs w:val="28"/>
+          <w:lang w:val="es-MX"/>
+        </w:rPr>
+      </w:pPr>
+      <w:r>
+        <w:rPr>
+          <w:rFonts w:ascii="Arial" w:hAnsi="Arial" w:eastAsia="SimSun" w:cs="Arial"/>
+          <w:i w:val="0"/>
+          <w:iCs w:val="0"/>
+          <w:color w:val="000000"/>
+          <w:sz w:val="22"/>
+          <w:szCs w:val="22"/>
+          <w:u w:val="none"/>
+          <w:vertAlign w:val="baseline"/>
+        </w:rPr>
+        <w:drawing>
+          <wp:inline distT="0" distB="0" distL="114300" distR="114300">
+            <wp:extent cx="2141220" cy="3211830"/>
+            <wp:effectExtent l="0" t="0" r="11430" b="7620"/>
+            <wp:docPr id="2" name="Imagen 2" descr="IMG_256"/>
+            <wp:cNvGraphicFramePr>
+              <a:graphicFrameLocks xmlns:a="http://schemas.openxmlformats.org/drawingml/2006/main" noChangeAspect="1"/>
+            </wp:cNvGraphicFramePr>
+            <a:graphic xmlns:a="http://schemas.openxmlformats.org/drawingml/2006/main">
+              <a:graphicData uri="http://schemas.openxmlformats.org/drawingml/2006/picture">
+                <pic:pic xmlns:pic="http://schemas.openxmlformats.org/drawingml/2006/picture">
+                  <pic:nvPicPr>
+                    <pic:cNvPr id="2" name="Imagen 2" descr="IMG_256"/>
+                    <pic:cNvPicPr>
+                      <a:picLocks noChangeAspect="1"/>
+                    </pic:cNvPicPr>
+                  </pic:nvPicPr>
+                  <pic:blipFill>
+                    <a:blip r:embed="rId5"/>
+                    <a:stretch>
+                      <a:fillRect/>
+                    </a:stretch>
+                  </pic:blipFill>
+                  <pic:spPr>
+                    <a:xfrm>
+                      <a:off x="0" y="0"/>
+                      <a:ext cx="2141220" cy="3211830"/>
+                    </a:xfrm>
+                    <a:prstGeom prst="rect">
+                      <a:avLst/>
+                    </a:prstGeom>
+                    <a:noFill/>
+                    <a:ln w="9525">
+                      <a:noFill/>
+                    </a:ln>
+                  </pic:spPr>
+                </pic:pic>
+              </a:graphicData>
+            </a:graphic>
+          </wp:inline>
+        </w:drawing>
+      </w:r>
+    </w:p>
+    <w:p>
+      <w:pPr>
+        <w:jc w:val="both"/>
+        <w:rPr>
+          <w:rFonts w:hint="default" w:ascii="Arial" w:hAnsi="Arial" w:eastAsia="Helvetica" w:cs="Arial"/>
+          <w:i w:val="0"/>
+          <w:iCs w:val="0"/>
+          <w:caps w:val="0"/>
+          <w:spacing w:val="0"/>
+          <w:sz w:val="28"/>
+          <w:szCs w:val="28"/>
+          <w:lang w:val="es-MX"/>
+        </w:rPr>
+      </w:pPr>
+    </w:p>
+    <w:p>
+      <w:pPr>
+        <w:jc w:val="both"/>
+        <w:rPr>
+          <w:rFonts w:hint="default" w:ascii="Arial" w:hAnsi="Arial" w:eastAsia="Helvetica" w:cs="Arial"/>
+          <w:b/>
+          <w:bCs/>
+          <w:i/>
+          <w:iCs/>
+          <w:caps w:val="0"/>
+          <w:spacing w:val="0"/>
+          <w:sz w:val="32"/>
+          <w:szCs w:val="32"/>
+          <w:lang w:val="es-MX"/>
+        </w:rPr>
+      </w:pPr>
+    </w:p>
+    <w:p>
+      <w:pPr>
+        <w:jc w:val="both"/>
+        <w:rPr>
+          <w:rFonts w:hint="default" w:ascii="Arial" w:hAnsi="Arial" w:eastAsia="Helvetica" w:cs="Arial"/>
+          <w:b/>
+          <w:bCs/>
+          <w:i/>
+          <w:iCs/>
+          <w:caps w:val="0"/>
+          <w:spacing w:val="0"/>
+          <w:sz w:val="32"/>
+          <w:szCs w:val="32"/>
+          <w:lang w:val="es-MX"/>
+        </w:rPr>
+      </w:pPr>
+      <w:r>
+        <w:rPr>
+          <w:rFonts w:hint="default" w:ascii="Arial" w:hAnsi="Arial" w:eastAsia="Helvetica" w:cs="Arial"/>
+          <w:b/>
+          <w:bCs/>
+          <w:i/>
+          <w:iCs/>
+          <w:caps w:val="0"/>
+          <w:spacing w:val="0"/>
+          <w:sz w:val="32"/>
+          <w:szCs w:val="32"/>
+          <w:lang w:val="es-MX"/>
+        </w:rPr>
+        <w:t>Identificación de Persona</w:t>
+      </w:r>
+    </w:p>
+    <w:p>
+      <w:pPr>
+        <w:jc w:val="both"/>
+        <w:rPr>
+          <w:rFonts w:hint="default" w:ascii="Arial" w:hAnsi="Arial" w:eastAsia="Helvetica" w:cs="Arial"/>
+          <w:i w:val="0"/>
+          <w:iCs w:val="0"/>
+          <w:caps w:val="0"/>
+          <w:spacing w:val="0"/>
+          <w:sz w:val="28"/>
+          <w:szCs w:val="28"/>
+          <w:lang w:val="es-MX"/>
+        </w:rPr>
+      </w:pPr>
+      <w:r>
+        <w:rPr>
+          <w:rFonts w:hint="default" w:ascii="Arial" w:hAnsi="Arial" w:eastAsia="Helvetica" w:cs="Arial"/>
+          <w:b/>
+          <w:bCs/>
+          <w:i w:val="0"/>
+          <w:iCs w:val="0"/>
+          <w:caps w:val="0"/>
+          <w:spacing w:val="0"/>
+          <w:sz w:val="28"/>
+          <w:szCs w:val="28"/>
+          <w:lang w:val="es-MX"/>
+        </w:rPr>
+        <w:t>Se configuró el inicio y la captura de la huella</w:t>
+      </w:r>
+      <w:r>
+        <w:rPr>
+          <w:rFonts w:hint="default" w:ascii="Arial" w:hAnsi="Arial" w:eastAsia="Helvetica" w:cs="Arial"/>
+          <w:i w:val="0"/>
+          <w:iCs w:val="0"/>
+          <w:caps w:val="0"/>
+          <w:spacing w:val="0"/>
+          <w:sz w:val="28"/>
+          <w:szCs w:val="28"/>
+          <w:lang w:val="es-MX"/>
+        </w:rPr>
+        <w:t xml:space="preserve">: Se estableció el punto de partida en el módulo de búsqueda y verificación, donde el usuario coloca su dedo en el lector para iniciar la autenticación mediante la toma de su huella digital.   </w:t>
+      </w:r>
+    </w:p>
+    <w:p>
+      <w:pPr>
+        <w:jc w:val="both"/>
+        <w:rPr>
+          <w:rFonts w:hint="default" w:ascii="Arial" w:hAnsi="Arial" w:eastAsia="Helvetica" w:cs="Arial"/>
+          <w:i w:val="0"/>
+          <w:iCs w:val="0"/>
+          <w:caps w:val="0"/>
+          <w:spacing w:val="0"/>
+          <w:sz w:val="28"/>
+          <w:szCs w:val="28"/>
+          <w:lang w:val="es-MX"/>
+        </w:rPr>
+      </w:pPr>
+      <w:r>
+        <w:rPr>
+          <w:rFonts w:hint="default" w:ascii="Arial" w:hAnsi="Arial" w:eastAsia="Helvetica" w:cs="Arial"/>
+          <w:b/>
+          <w:bCs/>
+          <w:i w:val="0"/>
+          <w:iCs w:val="0"/>
+          <w:caps w:val="0"/>
+          <w:color w:val="000000" w:themeColor="text1"/>
+          <w:spacing w:val="0"/>
+          <w:sz w:val="28"/>
+          <w:szCs w:val="28"/>
+          <w:lang w:val="es-MX"/>
+          <w14:textFill>
+            <w14:solidFill>
+              <w14:schemeClr w14:val="tx1"/>
+            </w14:solidFill>
+          </w14:textFill>
+        </w:rPr>
+        <w:t>Se programó el procesamiento y la búsqueda en la base de datos:</w:t>
+      </w:r>
+      <w:r>
+        <w:rPr>
+          <w:rFonts w:hint="default" w:ascii="Arial" w:hAnsi="Arial" w:eastAsia="Helvetica" w:cs="Arial"/>
+          <w:i w:val="0"/>
+          <w:iCs w:val="0"/>
+          <w:caps w:val="0"/>
+          <w:spacing w:val="0"/>
+          <w:sz w:val="28"/>
+          <w:szCs w:val="28"/>
+          <w:lang w:val="es-MX"/>
+        </w:rPr>
+        <w:t xml:space="preserve"> Se implementó el análisis de la huella para extraer sus minucias y generar una plantilla vectorial, realizando una comparación de tipo uno a muchos (1:N) frente a los registros almacenados.  </w:t>
+      </w:r>
+    </w:p>
+    <w:p>
+      <w:pPr>
+        <w:jc w:val="both"/>
+        <w:rPr>
+          <w:rFonts w:hint="default" w:ascii="Arial" w:hAnsi="Arial" w:eastAsia="Helvetica" w:cs="Arial"/>
+          <w:i w:val="0"/>
+          <w:iCs w:val="0"/>
+          <w:caps w:val="0"/>
+          <w:spacing w:val="0"/>
+          <w:sz w:val="28"/>
+          <w:szCs w:val="28"/>
+          <w:lang w:val="es-MX"/>
+        </w:rPr>
+      </w:pPr>
+      <w:r>
+        <w:rPr>
+          <w:rFonts w:hint="default" w:ascii="Arial" w:hAnsi="Arial" w:eastAsia="Helvetica" w:cs="Arial"/>
+          <w:b/>
+          <w:bCs/>
+          <w:i w:val="0"/>
+          <w:iCs w:val="0"/>
+          <w:caps w:val="0"/>
+          <w:spacing w:val="0"/>
+          <w:sz w:val="28"/>
+          <w:szCs w:val="28"/>
+          <w:lang w:val="es-MX"/>
+        </w:rPr>
+        <w:t>Se estableció la lógica de decisión y el resultado</w:t>
+      </w:r>
+      <w:r>
+        <w:rPr>
+          <w:rFonts w:hint="default" w:ascii="Arial" w:hAnsi="Arial" w:eastAsia="Helvetica" w:cs="Arial"/>
+          <w:i w:val="0"/>
+          <w:iCs w:val="0"/>
+          <w:caps w:val="0"/>
+          <w:spacing w:val="0"/>
+          <w:sz w:val="28"/>
+          <w:szCs w:val="28"/>
+          <w:lang w:val="es-MX"/>
+        </w:rPr>
+        <w:t xml:space="preserve">: Se configuró un punto de validación donde, si no se encuentra ninguna coincidencia, el sistema muestra el mensaje "Persona no registrada" y finaliza; si se encuentra una coincidencia exitosa, se recuperan y despliegan en pantalla los datos completos del usuario para concluir el procedimiento. </w:t>
+      </w:r>
     </w:p>
     <w:p>
       <w:pPr>

</xml_diff>

<commit_message>
Validación y flujo de resultados
</commit_message>
<xml_diff>
--- a/BitacoraProyecto.docx
+++ b/BitacoraProyecto.docx
@@ -797,8 +797,113 @@
           <w:szCs w:val="28"/>
           <w:lang w:val="es-MX"/>
         </w:rPr>
-        <w:t xml:space="preserve">: Se configuró un punto de validación donde, si no se encuentra ninguna coincidencia, el sistema muestra el mensaje "Persona no registrada" y finaliza; si se encuentra una coincidencia exitosa, se recuperan y despliegan en pantalla los datos completos del usuario para concluir el procedimiento. </w:t>
-      </w:r>
+        <w:t>: Se configuró un punto de validación donde, si no se encuentra ninguna coincidencia, el sistema muestra el mensaje "Persona no registrada" y finaliza; si se encuentra una coincidencia exitosa, se recuperan y despliegan en pantalla los datos completos del usuario para concluir el procedimiento..</w:t>
+      </w:r>
+    </w:p>
+    <w:p>
+      <w:pPr>
+        <w:jc w:val="both"/>
+        <w:rPr>
+          <w:rFonts w:hint="default" w:ascii="Arial" w:hAnsi="Arial" w:eastAsia="Helvetica" w:cs="Arial"/>
+          <w:i w:val="0"/>
+          <w:iCs w:val="0"/>
+          <w:caps w:val="0"/>
+          <w:spacing w:val="0"/>
+          <w:sz w:val="28"/>
+          <w:szCs w:val="28"/>
+          <w:lang w:val="es-MX"/>
+        </w:rPr>
+      </w:pPr>
+    </w:p>
+    <w:p>
+      <w:pPr>
+        <w:jc w:val="both"/>
+        <w:rPr>
+          <w:rFonts w:hint="default" w:ascii="Arial" w:hAnsi="Arial" w:eastAsia="Helvetica" w:cs="Arial"/>
+          <w:i w:val="0"/>
+          <w:iCs w:val="0"/>
+          <w:caps w:val="0"/>
+          <w:spacing w:val="0"/>
+          <w:sz w:val="28"/>
+          <w:szCs w:val="28"/>
+          <w:lang w:val="es-MX"/>
+        </w:rPr>
+      </w:pPr>
+    </w:p>
+    <w:p>
+      <w:pPr>
+        <w:jc w:val="both"/>
+        <w:rPr>
+          <w:rFonts w:hint="default" w:ascii="Arial" w:hAnsi="Arial" w:eastAsia="Helvetica" w:cs="Arial"/>
+          <w:i w:val="0"/>
+          <w:iCs w:val="0"/>
+          <w:caps w:val="0"/>
+          <w:spacing w:val="0"/>
+          <w:sz w:val="28"/>
+          <w:szCs w:val="28"/>
+          <w:lang w:val="es-MX"/>
+        </w:rPr>
+      </w:pPr>
+    </w:p>
+    <w:p>
+      <w:pPr>
+        <w:jc w:val="both"/>
+        <w:rPr>
+          <w:rFonts w:hint="default" w:ascii="Arial" w:hAnsi="Arial" w:eastAsia="Helvetica" w:cs="Arial"/>
+          <w:i w:val="0"/>
+          <w:iCs w:val="0"/>
+          <w:caps w:val="0"/>
+          <w:spacing w:val="0"/>
+          <w:sz w:val="28"/>
+          <w:szCs w:val="28"/>
+          <w:lang w:val="es-MX"/>
+        </w:rPr>
+      </w:pPr>
+    </w:p>
+    <w:p>
+      <w:pPr>
+        <w:jc w:val="both"/>
+        <w:rPr>
+          <w:rFonts w:hint="default" w:ascii="Arial" w:hAnsi="Arial" w:eastAsia="Helvetica" w:cs="Arial"/>
+          <w:i w:val="0"/>
+          <w:iCs w:val="0"/>
+          <w:caps w:val="0"/>
+          <w:spacing w:val="0"/>
+          <w:sz w:val="28"/>
+          <w:szCs w:val="28"/>
+          <w:lang w:val="es-MX"/>
+        </w:rPr>
+      </w:pPr>
+    </w:p>
+    <w:p>
+      <w:pPr>
+        <w:jc w:val="both"/>
+        <w:rPr>
+          <w:rFonts w:hint="default" w:ascii="Arial" w:hAnsi="Arial" w:eastAsia="Helvetica" w:cs="Arial"/>
+          <w:i w:val="0"/>
+          <w:iCs w:val="0"/>
+          <w:caps w:val="0"/>
+          <w:spacing w:val="0"/>
+          <w:sz w:val="28"/>
+          <w:szCs w:val="28"/>
+          <w:lang w:val="es-MX"/>
+        </w:rPr>
+      </w:pPr>
+    </w:p>
+    <w:p>
+      <w:pPr>
+        <w:jc w:val="both"/>
+        <w:rPr>
+          <w:rFonts w:hint="default" w:ascii="Arial" w:hAnsi="Arial" w:eastAsia="Helvetica" w:cs="Arial"/>
+          <w:i w:val="0"/>
+          <w:iCs w:val="0"/>
+          <w:caps w:val="0"/>
+          <w:spacing w:val="0"/>
+          <w:sz w:val="28"/>
+          <w:szCs w:val="28"/>
+          <w:lang w:val="es-MX"/>
+        </w:rPr>
+      </w:pPr>
     </w:p>
     <w:p>
       <w:pPr>
@@ -816,111 +921,6 @@
       </w:pPr>
       <w:bookmarkStart w:id="0" w:name="_GoBack"/>
       <w:bookmarkEnd w:id="0"/>
-    </w:p>
-    <w:p>
-      <w:pPr>
-        <w:jc w:val="both"/>
-        <w:rPr>
-          <w:rFonts w:hint="default" w:ascii="Arial" w:hAnsi="Arial" w:eastAsia="Helvetica" w:cs="Arial"/>
-          <w:i w:val="0"/>
-          <w:iCs w:val="0"/>
-          <w:caps w:val="0"/>
-          <w:spacing w:val="0"/>
-          <w:sz w:val="28"/>
-          <w:szCs w:val="28"/>
-          <w:lang w:val="es-MX"/>
-        </w:rPr>
-      </w:pPr>
-    </w:p>
-    <w:p>
-      <w:pPr>
-        <w:jc w:val="both"/>
-        <w:rPr>
-          <w:rFonts w:hint="default" w:ascii="Arial" w:hAnsi="Arial" w:eastAsia="Helvetica" w:cs="Arial"/>
-          <w:i w:val="0"/>
-          <w:iCs w:val="0"/>
-          <w:caps w:val="0"/>
-          <w:spacing w:val="0"/>
-          <w:sz w:val="28"/>
-          <w:szCs w:val="28"/>
-          <w:lang w:val="es-MX"/>
-        </w:rPr>
-      </w:pPr>
-    </w:p>
-    <w:p>
-      <w:pPr>
-        <w:jc w:val="both"/>
-        <w:rPr>
-          <w:rFonts w:hint="default" w:ascii="Arial" w:hAnsi="Arial" w:eastAsia="Helvetica" w:cs="Arial"/>
-          <w:i w:val="0"/>
-          <w:iCs w:val="0"/>
-          <w:caps w:val="0"/>
-          <w:spacing w:val="0"/>
-          <w:sz w:val="28"/>
-          <w:szCs w:val="28"/>
-          <w:lang w:val="es-MX"/>
-        </w:rPr>
-      </w:pPr>
-    </w:p>
-    <w:p>
-      <w:pPr>
-        <w:jc w:val="both"/>
-        <w:rPr>
-          <w:rFonts w:hint="default" w:ascii="Arial" w:hAnsi="Arial" w:eastAsia="Helvetica" w:cs="Arial"/>
-          <w:i w:val="0"/>
-          <w:iCs w:val="0"/>
-          <w:caps w:val="0"/>
-          <w:spacing w:val="0"/>
-          <w:sz w:val="28"/>
-          <w:szCs w:val="28"/>
-          <w:lang w:val="es-MX"/>
-        </w:rPr>
-      </w:pPr>
-    </w:p>
-    <w:p>
-      <w:pPr>
-        <w:jc w:val="both"/>
-        <w:rPr>
-          <w:rFonts w:hint="default" w:ascii="Arial" w:hAnsi="Arial" w:eastAsia="Helvetica" w:cs="Arial"/>
-          <w:i w:val="0"/>
-          <w:iCs w:val="0"/>
-          <w:caps w:val="0"/>
-          <w:spacing w:val="0"/>
-          <w:sz w:val="28"/>
-          <w:szCs w:val="28"/>
-          <w:lang w:val="es-MX"/>
-        </w:rPr>
-      </w:pPr>
-    </w:p>
-    <w:p>
-      <w:pPr>
-        <w:jc w:val="both"/>
-        <w:rPr>
-          <w:rFonts w:hint="default" w:ascii="Arial" w:hAnsi="Arial" w:eastAsia="Helvetica" w:cs="Arial"/>
-          <w:i w:val="0"/>
-          <w:iCs w:val="0"/>
-          <w:caps w:val="0"/>
-          <w:spacing w:val="0"/>
-          <w:sz w:val="28"/>
-          <w:szCs w:val="28"/>
-          <w:lang w:val="es-MX"/>
-        </w:rPr>
-      </w:pPr>
-    </w:p>
-    <w:p>
-      <w:pPr>
-        <w:jc w:val="both"/>
-        <w:rPr>
-          <w:rFonts w:hint="default" w:ascii="Arial" w:hAnsi="Arial" w:eastAsia="Helvetica" w:cs="Arial"/>
-          <w:i w:val="0"/>
-          <w:iCs w:val="0"/>
-          <w:caps w:val="0"/>
-          <w:spacing w:val="0"/>
-          <w:sz w:val="28"/>
-          <w:szCs w:val="28"/>
-          <w:lang w:val="es-MX"/>
-        </w:rPr>
-      </w:pPr>
     </w:p>
     <w:p>
       <w:pPr>

</xml_diff>